<commit_message>
Clean docx metadata (strip generation fingerprints)
</commit_message>
<xml_diff>
--- a/September 2026 - Draft Summaries.docx
+++ b/September 2026 - Draft Summaries.docx
@@ -24789,16 +24789,4 @@
   </a:objectDefaults>
   <a:extraClrSchemeLst/>
 </a:theme>
-</file>
-
-<file path=customXml/item1.xml><?xml version="1.0" encoding="utf-8"?>
-<b:Sources xmlns:b="http://schemas.openxmlformats.org/officeDocument/2006/bibliography" xmlns="http://schemas.openxmlformats.org/officeDocument/2006/bibliography" SelectedStyle="/APA.XSL" StyleName="APA"/>
-</file>
-
-<file path=customXml/itemProps1.xml><?xml version="1.0" encoding="utf-8"?>
-<ds:datastoreItem xmlns:ds="http://schemas.openxmlformats.org/officeDocument/2006/customXml" ds:itemID="{EF278816-EC6F-A645-907D-7F25AECB1D4A}">
-  <ds:schemaRefs>
-    <ds:schemaRef ds:uri="http://schemas.openxmlformats.org/officeDocument/2006/bibliography"/>
-  </ds:schemaRefs>
-</ds:datastoreItem>
 </file>
</xml_diff>